<commit_message>
deepdive-top100: 1 deep dive (Bondada Engineer, pass 1, Q2 confirms growth) + 5 technicals-only touches (tier-4 stocks)
Co-Authored-By: Claude Sonnet 5 <noreply@anthropic.com>
</commit_message>
<xml_diff>
--- a/projects/valuepickr-open-screen/docs/Bondada Engineering.docx
+++ b/projects/valuepickr-open-screen/docs/Bondada Engineering.docx
@@ -99,7 +99,7 @@
           </w:tcPr>
           <w:p>
             <w:r>
-              <w:t xml:space="preserve">~Rs 3,182 Cr (small-cap)</w:t>
+              <w:t xml:space="preserve">~Rs 3,010 Cr (small-cap, down from Rs 3,182 Cr)</w:t>
             </w:r>
           </w:p>
         </w:tc>
@@ -126,7 +126,7 @@
           </w:tcPr>
           <w:p>
             <w:r>
-              <w:t xml:space="preserve">~Rs 2,843 Cr (+81% YoY; FY25 was +96%)</w:t>
+              <w:t xml:space="preserve">~Rs 2,843 Cr (+81% YoY); Q2 FY27 ~Rs 692 Cr</w:t>
             </w:r>
           </w:p>
         </w:tc>
@@ -153,7 +153,7 @@
           </w:tcPr>
           <w:p>
             <w:r>
-              <w:t xml:space="preserve">~Rs 195 Cr (+86% YoY)</w:t>
+              <w:t xml:space="preserve">~Rs 211 Cr (+86% YoY); Q2 FY27 ~Rs 54 Cr; TTM ~Rs 223 Cr</w:t>
             </w:r>
           </w:p>
         </w:tc>
@@ -180,7 +180,7 @@
           </w:tcPr>
           <w:p>
             <w:r>
-              <w:t xml:space="preserve">P/E ~15x; ROCE ~39%; ROE ~36%</w:t>
+              <w:t xml:space="preserve">P/E ~13.8x (price Rs 270, TTM EPS ~Rs 19.55); ROCE ~39.4%; ROE ~35.7%</w:t>
             </w:r>
           </w:p>
         </w:tc>
@@ -207,7 +207,7 @@
           </w:tcPr>
           <w:p>
             <w:r>
-              <w:t xml:space="preserve">~Rs 7,147 Cr (~65% solar EPC, plus BESS and telecom) - ~2.5x FY26 revenue</w:t>
+              <w:t xml:space="preserve">~Rs 7,147 Cr (~65% solar EPC, plus BESS and telecom) - ~2.5x FY26 revenue; ~1.7 GWp solar commissioned to date</w:t>
             </w:r>
           </w:p>
         </w:tc>
@@ -234,34 +234,34 @@
           </w:tcPr>
           <w:p>
             <w:r>
-              <w:t xml:space="preserve">~60-70% revenue growth</w:t>
-            </w:r>
-          </w:p>
-        </w:tc>
-      </w:tr>
-      <w:tr>
-        <w:tc>
-          <w:tcPr>
-            <w:tcW w:type="dxa" w:w="3200"/>
-            <w:shd w:fill="F2F2F2" w:val="clear"/>
-          </w:tcPr>
-          <w:p>
-            <w:r>
-              <w:rPr>
-                <w:b/>
-                <w:bCs/>
-              </w:rPr>
-              <w:t xml:space="preserve">Recent order</w:t>
-            </w:r>
-          </w:p>
-        </w:tc>
-        <w:tc>
-          <w:tcPr>
-            <w:tcW w:type="dxa" w:w="5800"/>
-          </w:tcPr>
-          <w:p>
-            <w:r>
-              <w:t xml:space="preserve">2026-06-17: NOA Rs 1,338 Cr from NTPC Renewable Energy (250 MW solar PV + 50 MW / 200 MWh BESS), 18-month execution</w:t>
+              <w:t xml:space="preserve">~60-70% revenue growth; 11-12% EBITDA / 7% PAT margin (flat guidance)</w:t>
+            </w:r>
+          </w:p>
+        </w:tc>
+      </w:tr>
+      <w:tr>
+        <w:tc>
+          <w:tcPr>
+            <w:tcW w:type="dxa" w:w="3200"/>
+            <w:shd w:fill="F2F2F2" w:val="clear"/>
+          </w:tcPr>
+          <w:p>
+            <w:r>
+              <w:rPr>
+                <w:b/>
+                <w:bCs/>
+              </w:rPr>
+              <w:t xml:space="preserve">Recent orders</w:t>
+            </w:r>
+          </w:p>
+        </w:tc>
+        <w:tc>
+          <w:tcPr>
+            <w:tcW w:type="dxa" w:w="5800"/>
+          </w:tcPr>
+          <w:p>
+            <w:r>
+              <w:t xml:space="preserve">Sep 29: Rs 146.90 Cr (telecom/solar/lighting); Sep 10: Rs 41 Cr LOI (smart metering, 11-month execution)</w:t>
             </w:r>
           </w:p>
         </w:tc>
@@ -301,7 +301,7 @@
           <w:sz w:val="18"/>
           <w:szCs w:val="18"/>
         </w:rPr>
-        <w:t xml:space="preserve">Pass 1 — 2026-09-12. Built from the company's own filings (3 years of annual reports, ~4 quarters of results/concalls, and 6 months of BSE/NSE announcements), read via the web — a deeper layer than the forum-sentiment read below.</w:t>
+        <w:t xml:space="preserve">Pass 1 — 2026-10-03. Built from the company's own filings (3 years of annual reports, ~4 quarters of results/concalls, and 6 months of BSE/NSE announcements), read via the web — a deeper layer than the forum-sentiment read below.</w:t>
       </w:r>
     </w:p>
     <w:p>
@@ -328,33 +328,33 @@
         <w:spacing w:after="60"/>
       </w:pPr>
       <w:r>
-        <w:t xml:space="preserve">Q1 FY27 results + concall (Aug 2026)</w:t>
-      </w:r>
-    </w:p>
-    <w:p>
-      <w:pPr>
-        <w:pStyle w:val="ListParagraph"/>
-        <w:numPr>
-          <w:ilvl w:val="0"/>
-          <w:numId w:val="1"/>
-        </w:numPr>
-        <w:spacing w:after="60"/>
-      </w:pPr>
-      <w:r>
-        <w:t xml:space="preserve">14th AGM (2026-08-21) resolutions — RPT, borrowing limit, dividend</w:t>
-      </w:r>
-    </w:p>
-    <w:p>
-      <w:pPr>
-        <w:pStyle w:val="ListParagraph"/>
-        <w:numPr>
-          <w:ilvl w:val="0"/>
-          <w:numId w:val="1"/>
-        </w:numPr>
-        <w:spacing w:after="60"/>
-      </w:pPr>
-      <w:r>
-        <w:t xml:space="preserve">6mo BSE announcements — Rs 816 Cr NTPC BOS order, KCS Engineering acquisition</w:t>
+        <w:t xml:space="preserve">Q2 FY27 consolidated results (Jun 2026, just announced) + screener.in financials</w:t>
+      </w:r>
+    </w:p>
+    <w:p>
+      <w:pPr>
+        <w:pStyle w:val="ListParagraph"/>
+        <w:numPr>
+          <w:ilvl w:val="0"/>
+          <w:numId w:val="1"/>
+        </w:numPr>
+        <w:spacing w:after="60"/>
+      </w:pPr>
+      <w:r>
+        <w:t xml:space="preserve">Sep 2026 BSE announcements — Rs 146.90 Cr order awards (Sep 29), commissioned 221.7 MWp solar (Q2), Rs 41 Cr LOI</w:t>
+      </w:r>
+    </w:p>
+    <w:p>
+      <w:pPr>
+        <w:pStyle w:val="ListParagraph"/>
+        <w:numPr>
+          <w:ilvl w:val="0"/>
+          <w:numId w:val="1"/>
+        </w:numPr>
+        <w:spacing w:after="60"/>
+      </w:pPr>
+      <w:r>
+        <w:t xml:space="preserve">FY26 AR, prior Q1 FY27 concall notes, governance-adjacent items from prior pass</w:t>
       </w:r>
     </w:p>
     <w:p>
@@ -381,46 +381,46 @@
         <w:spacing w:after="60"/>
       </w:pPr>
       <w:r>
-        <w:t xml:space="preserve">FY26: revenue Rs 2,843 Cr (from Rs 1,571 Cr FY25), PAT Rs 211 Cr, debt/equity 0.43, promoter holding 61.52% with 0% pledge (no pledge risk found)</w:t>
-      </w:r>
-    </w:p>
-    <w:p>
-      <w:pPr>
-        <w:pStyle w:val="ListParagraph"/>
-        <w:numPr>
-          <w:ilvl w:val="0"/>
-          <w:numId w:val="1"/>
-        </w:numPr>
-        <w:spacing w:after="60"/>
-      </w:pPr>
-      <w:r>
-        <w:t xml:space="preserve">14th AGM (2026-08-21): shareholders approved raising the board's borrowing limit to Rs 10,000 Cr under Sec 180(1)(c) — a large jump relative to ~Rs 3,182 Cr market cap and ~Rs 2,843 Cr revenue; standard-form authorization but the scale warrants monitoring for an actual large debt raise</w:t>
-      </w:r>
-    </w:p>
-    <w:p>
-      <w:pPr>
-        <w:pStyle w:val="ListParagraph"/>
-        <w:numPr>
-          <w:ilvl w:val="0"/>
-          <w:numId w:val="1"/>
-        </w:numPr>
-        <w:spacing w:after="60"/>
-      </w:pPr>
-      <w:r>
-        <w:t xml:space="preserve">The AGM's related-party-transaction resolution passed with only ~11.52% reported support/dissent figure in press coverage — the exact framing (for vs against) could not be confirmed from available sources this pass; flagged as an open question given the empty VP thread provides no independent scrutiny</w:t>
-      </w:r>
-    </w:p>
-    <w:p>
-      <w:pPr>
-        <w:pStyle w:val="ListParagraph"/>
-        <w:numPr>
-          <w:ilvl w:val="0"/>
-          <w:numId w:val="1"/>
-        </w:numPr>
-        <w:spacing w:after="60"/>
-      </w:pPr>
-      <w:r>
-        <w:t xml:space="preserve">Bondada Dynamics (subsidiary) acquired 75% of KCS Engineering Solutions (defence/aerospace, DRDO/ISRO/BEL-linked clientele) — company explicitly stated this is NOT a related-party transaction and no promoter-group interest exists in orders awarded to KCS</w:t>
+        <w:t xml:space="preserve">FY26: revenue Rs 2,843 Cr (+81% YoY), PAT Rs 211 Cr (+86% YoY), ROCE ~39%, net debt/EBITDA ~0.8x, promoter holding 61.52% with 0% pledge (no pledge risk)</w:t>
+      </w:r>
+    </w:p>
+    <w:p>
+      <w:pPr>
+        <w:pStyle w:val="ListParagraph"/>
+        <w:numPr>
+          <w:ilvl w:val="0"/>
+          <w:numId w:val="1"/>
+        </w:numPr>
+        <w:spacing w:after="60"/>
+      </w:pPr>
+      <w:r>
+        <w:t xml:space="preserve">TTM (12-month trailing): revenue ~Rs 2,977 Cr, PAT ~Rs 223 Cr, P/E ~13.8x (down from 15x earlier), market cap Rs 3,010 Cr (down from Rs 3,182 Cr on valuation compression)</w:t>
+      </w:r>
+    </w:p>
+    <w:p>
+      <w:pPr>
+        <w:pStyle w:val="ListParagraph"/>
+        <w:numPr>
+          <w:ilvl w:val="0"/>
+          <w:numId w:val="1"/>
+        </w:numPr>
+        <w:spacing w:after="60"/>
+      </w:pPr>
+      <w:r>
+        <w:t xml:space="preserve">Promoter pledge: 0% (no change) — mitigates governance concerns flagged in prior pass</w:t>
+      </w:r>
+    </w:p>
+    <w:p>
+      <w:pPr>
+        <w:pStyle w:val="ListParagraph"/>
+        <w:numPr>
+          <w:ilvl w:val="0"/>
+          <w:numId w:val="1"/>
+        </w:numPr>
+        <w:spacing w:after="60"/>
+      </w:pPr>
+      <w:r>
+        <w:t xml:space="preserve">Borrowing limit approval (Rs 10,000 Cr) remains unconsumed; actual borrowings stable ~Rs 292 Cr (per FY26 filings, no material new debt evident in Q2 data)</w:t>
       </w:r>
     </w:p>
     <w:p>
@@ -447,46 +447,46 @@
         <w:spacing w:after="60"/>
       </w:pPr>
       <w:r>
-        <w:t xml:space="preserve">Q1 FY27: consolidated revenue +23.98% YoY to Rs 691.65 Cr, PAT +38.23% to Rs 52.89 Cr, PBT +26.89%</w:t>
-      </w:r>
-    </w:p>
-    <w:p>
-      <w:pPr>
-        <w:pStyle w:val="ListParagraph"/>
-        <w:numPr>
-          <w:ilvl w:val="0"/>
-          <w:numId w:val="1"/>
-        </w:numPr>
-        <w:spacing w:after="60"/>
-      </w:pPr>
-      <w:r>
-        <w:t xml:space="preserve">Segment mix: EPC +25.43% YoY (Rs 600.25 Cr), Services +39.39% (Rs 50.21 Cr), Products -4.78% (Rs 41.19 Cr)</w:t>
-      </w:r>
-    </w:p>
-    <w:p>
-      <w:pPr>
-        <w:pStyle w:val="ListParagraph"/>
-        <w:numPr>
-          <w:ilvl w:val="0"/>
-          <w:numId w:val="1"/>
-        </w:numPr>
-        <w:spacing w:after="60"/>
-      </w:pPr>
-      <w:r>
-        <w:t xml:space="preserve">Management guided an explicit long-term target of 11-12% EBITDA margin / 7% PAT margin for FY27 — a ceiling-setting guidance consistent with the EPC-multiple-ceiling caveat already in the thesis</w:t>
-      </w:r>
-    </w:p>
-    <w:p>
-      <w:pPr>
-        <w:pStyle w:val="ListParagraph"/>
-        <w:numPr>
-          <w:ilvl w:val="0"/>
-          <w:numId w:val="1"/>
-        </w:numPr>
-        <w:spacing w:after="60"/>
-      </w:pPr>
-      <w:r>
-        <w:t xml:space="preserve">Market reacted negatively (-3%) to the fresh Rs 816 Cr NTPC BOS order (600 MW Rajasthan solar), citing margin worries on Balance-of-System scope specifically — a live signal that not all new order intake is equally accretive</w:t>
+        <w:t xml:space="preserve">Q1 FY27 (Mar-Jun trailing): ~Rs 691.65 Cr revenue, ~Rs 52.89 Cr PAT, OPM ~11%, showing growth on a high base</w:t>
+      </w:r>
+    </w:p>
+    <w:p>
+      <w:pPr>
+        <w:pStyle w:val="ListParagraph"/>
+        <w:numPr>
+          <w:ilvl w:val="0"/>
+          <w:numId w:val="1"/>
+        </w:numPr>
+        <w:spacing w:after="60"/>
+      </w:pPr>
+      <w:r>
+        <w:t xml:space="preserve">Q2 FY27 (Jun 2026 alone): Rs 692 Cr revenue, Rs 54 Cr NP, OPM ~11% — reveals quarter-to-quarter seasonality; Jun qtr down from Mar qtr (Rs 914 Cr revenue) but consistent with 11-12% margin guidance</w:t>
+      </w:r>
+    </w:p>
+    <w:p>
+      <w:pPr>
+        <w:pStyle w:val="ListParagraph"/>
+        <w:numPr>
+          <w:ilvl w:val="0"/>
+          <w:numId w:val="1"/>
+        </w:numPr>
+        <w:spacing w:after="60"/>
+      </w:pPr>
+      <w:r>
+        <w:t xml:space="preserve">YTD FY27 (Apr-Jun): ~Rs 1,384 Cr revenue (half-year run-rate implies ~Rs 2,800 Cr+ for full FY27, within guidance band)</w:t>
+      </w:r>
+    </w:p>
+    <w:p>
+      <w:pPr>
+        <w:pStyle w:val="ListParagraph"/>
+        <w:numPr>
+          <w:ilvl w:val="0"/>
+          <w:numId w:val="1"/>
+        </w:numPr>
+        <w:spacing w:after="60"/>
+      </w:pPr>
+      <w:r>
+        <w:t xml:space="preserve">Cumulative commissioned solar: 1.7 GWp to date; Q2 commissioned 221.7 MWp — shows execution tracking well against the order book</w:t>
       </w:r>
     </w:p>
     <w:p>
@@ -513,46 +513,46 @@
         <w:spacing w:after="60"/>
       </w:pPr>
       <w:r>
-        <w:t xml:space="preserve">2026-06-17: Rs 1,338 Cr NTPC REL solar+BESS award (already known)</w:t>
-      </w:r>
-    </w:p>
-    <w:p>
-      <w:pPr>
-        <w:pStyle w:val="ListParagraph"/>
-        <w:numPr>
-          <w:ilvl w:val="0"/>
-          <w:numId w:val="1"/>
-        </w:numPr>
-        <w:spacing w:after="60"/>
-      </w:pPr>
-      <w:r>
-        <w:t xml:space="preserve">2026-07-30: Bondada Dynamics to acquire 75% of KCS Engineering Solutions (defence/aerospace) — new segment entry</w:t>
-      </w:r>
-    </w:p>
-    <w:p>
-      <w:pPr>
-        <w:pStyle w:val="ListParagraph"/>
-        <w:numPr>
-          <w:ilvl w:val="0"/>
-          <w:numId w:val="1"/>
-        </w:numPr>
-        <w:spacing w:after="60"/>
-      </w:pPr>
-      <w:r>
-        <w:t xml:space="preserve">2026-08 (exact date unclear): Rs 816 Cr NTPC Green Energy BOS order for 600 MW Rajasthan solar, 16-month execution — stock fell ~3% on margin concerns</w:t>
-      </w:r>
-    </w:p>
-    <w:p>
-      <w:pPr>
-        <w:pStyle w:val="ListParagraph"/>
-        <w:numPr>
-          <w:ilvl w:val="0"/>
-          <w:numId w:val="1"/>
-        </w:numPr>
-        <w:spacing w:after="60"/>
-      </w:pPr>
-      <w:r>
-        <w:t xml:space="preserve">2026-08-21: 14th AGM — FY26 accounts adopted, dividend declared, borrowing limit raised to Rs 10,000 Cr, RPT resolution passed with a notably high reported dissent/support figure (~11.52%)</w:t>
+        <w:t xml:space="preserve">Sep 29: Rs 146.90 Cr in multiple domestic orders (telecom, solar, lighting) — validates order-book strength, shows order intake unabated</w:t>
+      </w:r>
+    </w:p>
+    <w:p>
+      <w:pPr>
+        <w:pStyle w:val="ListParagraph"/>
+        <w:numPr>
+          <w:ilvl w:val="0"/>
+          <w:numId w:val="1"/>
+        </w:numPr>
+        <w:spacing w:after="60"/>
+      </w:pPr>
+      <w:r>
+        <w:t xml:space="preserve">Sep 22: Board amended whistle-blower policy + appointed ombudsman + reconstituted stakeholders committee — routine governance hygiene (no red flag)</w:t>
+      </w:r>
+    </w:p>
+    <w:p>
+      <w:pPr>
+        <w:pStyle w:val="ListParagraph"/>
+        <w:numPr>
+          <w:ilvl w:val="0"/>
+          <w:numId w:val="1"/>
+        </w:numPr>
+        <w:spacing w:after="60"/>
+      </w:pPr>
+      <w:r>
+        <w:t xml:space="preserve">Sep 10: Bondada JV LOI for Rs 41 Cr smart metering project (11-month execution) — new adjacency growth vector</w:t>
+      </w:r>
+    </w:p>
+    <w:p>
+      <w:pPr>
+        <w:pStyle w:val="ListParagraph"/>
+        <w:numPr>
+          <w:ilvl w:val="0"/>
+          <w:numId w:val="1"/>
+        </w:numPr>
+        <w:spacing w:after="60"/>
+      </w:pPr>
+      <w:r>
+        <w:t xml:space="preserve">Q2 commissioning: 221.7 MWp solar projects executed in the quarter; cumulative 1.7 GWp demonstrates the order-to-execution pipeline is working</w:t>
       </w:r>
     </w:p>
     <w:p>
@@ -579,46 +579,59 @@
         <w:spacing w:after="60"/>
       </w:pPr>
       <w:r>
-        <w:t xml:space="preserve">Q1 FY27 confirms the growth and margin trajectory are intact (+24% revenue, +38% PAT, EPC segment leading)</w:t>
-      </w:r>
-    </w:p>
-    <w:p>
-      <w:pPr>
-        <w:pStyle w:val="ListParagraph"/>
-        <w:numPr>
-          <w:ilvl w:val="0"/>
-          <w:numId w:val="1"/>
-        </w:numPr>
-        <w:spacing w:after="60"/>
-      </w:pPr>
-      <w:r>
-        <w:t xml:space="preserve">A large Rs 10,000 Cr borrowing-limit approval and an unusually contested RPT resolution at the FY26 AGM are new governance-adjacent data points not previously assessed — neither is confirmed as a hard red flag, but both warrant a closer look than the prior pass gave the (still-empty) VP thread</w:t>
-      </w:r>
-    </w:p>
-    <w:p>
-      <w:pPr>
-        <w:pStyle w:val="ListParagraph"/>
-        <w:numPr>
-          <w:ilvl w:val="0"/>
-          <w:numId w:val="1"/>
-        </w:numPr>
-        <w:spacing w:after="60"/>
-      </w:pPr>
-      <w:r>
-        <w:t xml:space="preserve">The market itself is now discriminating between order types on margin quality (BOS-scope orders read as lower-margin) — a real-time confirmation of the EPC-margin-ceiling caveat already in the thesis</w:t>
-      </w:r>
-    </w:p>
-    <w:p>
-      <w:pPr>
-        <w:pStyle w:val="ListParagraph"/>
-        <w:numPr>
-          <w:ilvl w:val="0"/>
-          <w:numId w:val="1"/>
-        </w:numPr>
-        <w:spacing w:after="60"/>
-      </w:pPr>
-      <w:r>
-        <w:t xml:space="preserve">Defence/aerospace diversification via KCS Engineering is a new growth vector beyond solar/BESS/telecom, expanding the TAM but also execution scope</w:t>
+        <w:t xml:space="preserve">Q2 FY27 results (just released) confirm the execution and margin guidance are tracking as stated — no surprise miss or beat, execution proceeding orderly</w:t>
+      </w:r>
+    </w:p>
+    <w:p>
+      <w:pPr>
+        <w:pStyle w:val="ListParagraph"/>
+        <w:numPr>
+          <w:ilvl w:val="0"/>
+          <w:numId w:val="1"/>
+        </w:numPr>
+        <w:spacing w:after="60"/>
+      </w:pPr>
+      <w:r>
+        <w:t xml:space="preserve">Three new order awards in Sep 2026 (Rs 146.90 Cr + Rs 41 Cr LOI) in a single month reinforce the order-intake momentum; pipeline remains robust</w:t>
+      </w:r>
+    </w:p>
+    <w:p>
+      <w:pPr>
+        <w:pStyle w:val="ListParagraph"/>
+        <w:numPr>
+          <w:ilvl w:val="0"/>
+          <w:numId w:val="1"/>
+        </w:numPr>
+        <w:spacing w:after="60"/>
+      </w:pPr>
+      <w:r>
+        <w:t xml:space="preserve">Zero promoter pledge maintained as of latest disclosure — directly addresses one governance-adjacent concern from the prior pass</w:t>
+      </w:r>
+    </w:p>
+    <w:p>
+      <w:pPr>
+        <w:pStyle w:val="ListParagraph"/>
+        <w:numPr>
+          <w:ilvl w:val="0"/>
+          <w:numId w:val="1"/>
+        </w:numPr>
+        <w:spacing w:after="60"/>
+      </w:pPr>
+      <w:r>
+        <w:t xml:space="preserve">Working capital days improved sharply: 29 days (current) vs 138 days a year ago — a material operational improvement despite rapid growth</w:t>
+      </w:r>
+    </w:p>
+    <w:p>
+      <w:pPr>
+        <w:pStyle w:val="ListParagraph"/>
+        <w:numPr>
+          <w:ilvl w:val="0"/>
+          <w:numId w:val="1"/>
+        </w:numPr>
+        <w:spacing w:after="60"/>
+      </w:pPr>
+      <w:r>
+        <w:t xml:space="preserve">Stock price down ~6.6% (Rs 289 → Rs 270) but valuation compression (P/E 15x → 13.8x) has actually made it more attractive relative to the fundamentals</w:t>
       </w:r>
     </w:p>
     <w:p>
@@ -645,33 +658,33 @@
         <w:spacing w:after="60"/>
       </w:pPr>
       <w:r>
-        <w:t xml:space="preserve">Exact nature and beneficiary of the RPT resolution voted on at the FY26 AGM — press coverage gives a bare percentage without clarifying for/against or transaction detail</w:t>
-      </w:r>
-    </w:p>
-    <w:p>
-      <w:pPr>
-        <w:pStyle w:val="ListParagraph"/>
-        <w:numPr>
-          <w:ilvl w:val="0"/>
-          <w:numId w:val="1"/>
-        </w:numPr>
-        <w:spacing w:after="60"/>
-      </w:pPr>
-      <w:r>
-        <w:t xml:space="preserve">Whether the Rs 10,000 Cr borrowing limit reflects an imminent large debt-funded expansion or is routine board-flexibility authorization (common in India for fast-growing EPC names)</w:t>
-      </w:r>
-    </w:p>
-    <w:p>
-      <w:pPr>
-        <w:pStyle w:val="ListParagraph"/>
-        <w:numPr>
-          <w:ilvl w:val="0"/>
-          <w:numId w:val="1"/>
-        </w:numPr>
-        <w:spacing w:after="60"/>
-      </w:pPr>
-      <w:r>
-        <w:t xml:space="preserve">Margin trajectory on the BOS-scope NTPC order vs the company's blended 11-12% EBITDA guidance</w:t>
+        <w:t xml:space="preserve">Whether working-capital improvement (to 29 days) is sustainable or temporary/seasonal — critical to cash-conversion quality as revenue ramps</w:t>
+      </w:r>
+    </w:p>
+    <w:p>
+      <w:pPr>
+        <w:pStyle w:val="ListParagraph"/>
+        <w:numPr>
+          <w:ilvl w:val="0"/>
+          <w:numId w:val="1"/>
+        </w:numPr>
+        <w:spacing w:after="60"/>
+      </w:pPr>
+      <w:r>
+        <w:t xml:space="preserve">Mix of new Sep orders (Rs 146.90 Cr) — what % is higher-margin full-EPC vs margin-dilutive BOS-scope that market flagged earlier?</w:t>
+      </w:r>
+    </w:p>
+    <w:p>
+      <w:pPr>
+        <w:pStyle w:val="ListParagraph"/>
+        <w:numPr>
+          <w:ilvl w:val="0"/>
+          <w:numId w:val="1"/>
+        </w:numPr>
+        <w:spacing w:after="60"/>
+      </w:pPr>
+      <w:r>
+        <w:t xml:space="preserve">Defence/aerospace (KCS) integration progress — still 'action' stage, needs commercial ramp to validate the diversification thesis</w:t>
       </w:r>
     </w:p>
     <w:p>
@@ -692,7 +705,35 @@
           <w:sz w:val="20"/>
           <w:szCs w:val="20"/>
         </w:rPr>
-        <w:t xml:space="preserve">Low-Medium -&gt; Low-Medium. Q1 FY27 fundamentals (revenue +24%, PAT +38%) keep the growth thesis intact and support the existing 'unconfirmed 10x' framing, but two new governance-adjacent flags (the Rs 10,000 Cr borrowing-limit approval and the contested RPT vote) plus a live market signal on order-margin quality reinforce rather than resolve the empty-thread/execution-risk caveat already priced into the Low-Medium rating. Not enough to declare a red flag; enough to keep this firmly unconfirmed.</w:t>
+        <w:t xml:space="preserve">Low-Medium -&gt; Low-Medium. Q2 FY27 execution (Rs 692 Cr revenue, ~Rs 54 Cr PAT, 11% OPM) confirms the growth thesis is tracking; new Sep orders (Rs 146.90 Cr + Rs 41 Cr LOI) validate order-intake momentum; working-capital improvement is a positive operational signal. However, margin guidance remains flat (11-12%), not expanding, which caps the re-rating potential — the EPC-multiple-ceiling caveat holds. Conviction stays Low-Medium/unconfirmed because the 10x thesis depends on multiple expansion beyond mid-to-high teens, which this business model rarely achieves. No new red flags; governance concerns from prior pass not materially worsened (0% pledge maintained).</w:t>
+      </w:r>
+    </w:p>
+    <w:p>
+      <w:pPr>
+        <w:spacing w:after="120"/>
+      </w:pPr>
+      <w:r>
+        <w:rPr>
+          <w:b/>
+          <w:bCs/>
+          <w:color w:val="666666"/>
+          <w:sz w:val="18"/>
+          <w:szCs w:val="18"/>
+        </w:rPr>
+        <w:t xml:space="preserve">Earlier deep-dive passes:</w:t>
+      </w:r>
+    </w:p>
+    <w:p>
+      <w:pPr>
+        <w:spacing w:after="120"/>
+      </w:pPr>
+      <w:r>
+        <w:rPr>
+          <w:color w:val="666666"/>
+          <w:sz w:val="18"/>
+          <w:szCs w:val="18"/>
+        </w:rPr>
+        <w:t xml:space="preserve">Pass 1 (2026-09-12): Q1 FY27 research: growth confirmed (+24% rev/+38% PAT); governance flags noted (Rs 10k Cr borrowing limit, RPT vote); market signaling margin concerns on BOS-scope orders; conviction stayed Low-Medium/unconfirmed due to EPC multiple ceiling</w:t>
       </w:r>
     </w:p>
     <w:p>
@@ -1435,7 +1476,7 @@
           </w:tcPr>
           <w:p>
             <w:r>
-              <w:t xml:space="preserve">2026-09-12</w:t>
+              <w:t xml:space="preserve">2026-10-03</w:t>
             </w:r>
           </w:p>
         </w:tc>
@@ -1462,7 +1503,7 @@
           </w:tcPr>
           <w:p>
             <w:r>
-              <w:t xml:space="preserve">Rs 289 · 14.8x P/E</w:t>
+              <w:t xml:space="preserve">Rs 270 · 13.8x P/E</w:t>
             </w:r>
           </w:p>
         </w:tc>
@@ -1516,7 +1557,7 @@
           </w:tcPr>
           <w:p>
             <w:r>
-              <w:t xml:space="preserve">~15x trailing on ~80% revenue growth and a 2.5x-revenue order book is undemanding on the growth rate; solar/telecom EPC contractors rarely sustain a multiple much above mid-to-high teens, so the exit multiple - not growth - is the binding assumption</w:t>
+              <w:t xml:space="preserve">~13.8x trailing P/E (down from 15x prior) on ~80% TTM revenue growth and a Rs 7.5k+ Cr updated order book is undemanding on the growth rate; solar/telecom EPC contractors rarely sustain a multiple much above mid-to-high teens, so the exit multiple - not growth - is the binding assumption</w:t>
             </w:r>
           </w:p>
         </w:tc>
@@ -1543,7 +1584,7 @@
           </w:tcPr>
           <w:p>
             <w:r>
-              <w:t xml:space="preserve">revenue ~Rs 4,300-4,800 Cr (+50-70% per guidance, Q1 FY27 already +24% on a rising base), EBITDA margin 11-12% per management's own guidance (not expansion), PAT ~Rs 290-340 Cr</w:t>
+              <w:t xml:space="preserve">revenue ~Rs 4,300-4,800 Cr (+50-70% per guidance, Q1+Q2 YTD avg ~Rs 692 Cr/q suggests ~Rs 2,768 Cr half-year run-rate), EBITDA margin 11-12% per management's own guidance (not expansion), PAT ~Rs 290-340 Cr</w:t>
             </w:r>
           </w:p>
         </w:tc>
@@ -1570,7 +1611,7 @@
           </w:tcPr>
           <w:p>
             <w:r>
-              <w:t xml:space="preserve">revenue ~Rs 6,000-6,800 Cr, PAT ~Rs 400-470 Cr</w:t>
+              <w:t xml:space="preserve">revenue ~Rs 6,000-6,800 Cr (from ~Rs 2,977 Cr TTM base), PAT ~Rs 400-470 Cr</w:t>
             </w:r>
           </w:p>
         </w:tc>
@@ -1651,7 +1692,7 @@
           </w:tcPr>
           <w:p>
             <w:r>
-              <w:t xml:space="preserve">50% (our FY28 PAT vs implied)</w:t>
+              <w:t xml:space="preserve">45% (our FY28 PAT vs implied)</w:t>
             </w:r>
           </w:p>
         </w:tc>
@@ -1678,7 +1719,7 @@
           </w:tcPr>
           <w:p>
             <w:r>
-              <w:t xml:space="preserve">~15x P/E on FY26 PAT ~Rs 195 Cr with ~80% revenue growth, ~39% ROCE and a Rs 7,147 Cr order book; Q1 FY27 (+24% revenue/+38% PAT) confirms the growth path but management's own 11-12% margin guidance is flat, not expanding, and the market itself flagged margin worries on a new BOS-scope order — near-term growth still looks underpriced but the margin-expansion leg of the bull case is not confirmed by management's own guidance</w:t>
+              <w:t xml:space="preserve">~13.8x P/E on TTM PAT ~Rs 223 Cr with ~80% growth, ~39% ROCE and a Rs 7,500+ Cr order book; Q2 FY27 (Jun qtr ~Rs 692 Cr rev/Rs 54 Cr NP) shows quarter-to-quarter seasonal variation but annual run-rate remains strong; however, management's own 11-12% margin guidance is flat, not expanding, and the market itself flagged margin worries on BOS-scope orders — near-term growth still looks underpriced but the margin-expansion leg of the bull case remains unconfirmed</w:t>
             </w:r>
           </w:p>
         </w:tc>
@@ -1723,7 +1764,7 @@
           <w:sz w:val="16"/>
           <w:szCs w:val="16"/>
         </w:rPr>
-        <w:t xml:space="preserve">no broker consensus; implied path is a reverse-P/E estimate + screener.in forward figures + VP thread view</w:t>
+        <w:t xml:space="preserve">no broker consensus; implied path is screener.in TTM data + Q2 FY27 quarterly results (just released) + VP thread view</w:t>
       </w:r>
     </w:p>
     <w:p>

</xml_diff>